<commit_message>
feat: informe del juego en PDF
</commit_message>
<xml_diff>
--- a/Informe del juego.docx
+++ b/Informe del juego.docx
@@ -117,7 +117,23 @@
           <w:rFonts w:asciiTheme="majorBidi" w:hAnsiTheme="majorBidi" w:cstheme="majorBidi"/>
           <w:lang w:val="es-GT"/>
         </w:rPr>
-        <w:t>qué jugador tiene ventaja cuando Minimax alcanza el límite de profundidad sin encontrar un estado terminal. La evaluación se calcula desde la perspectiva de P1: los valores positivos favorecen a P1, los negativos favorecen a P2 y los valores cercanos a cero indican una posición equilibrada</w:t>
+        <w:t xml:space="preserve">qué jugador tiene ventaja cuando </w:t>
+      </w:r>
+      <w:proofErr w:type="spellStart"/>
+      <w:r>
+        <w:rPr>
+          <w:rFonts w:asciiTheme="majorBidi" w:hAnsiTheme="majorBidi" w:cstheme="majorBidi"/>
+          <w:lang w:val="es-GT"/>
+        </w:rPr>
+        <w:t>Minimax</w:t>
+      </w:r>
+      <w:proofErr w:type="spellEnd"/>
+      <w:r>
+        <w:rPr>
+          <w:rFonts w:asciiTheme="majorBidi" w:hAnsiTheme="majorBidi" w:cstheme="majorBidi"/>
+          <w:lang w:val="es-GT"/>
+        </w:rPr>
+        <w:t xml:space="preserve"> alcanza el límite de profundidad sin encontrar un estado terminal. La evaluación se calcula desde la perspectiva de P1: los valores positivos favorecen a P1, los negativos favorecen a P2 y los valores cercanos a cero indican una posición equilibrada</w:t>
       </w:r>
       <w:r>
         <w:rPr>
@@ -172,8 +188,6 @@
       <w:r>
         <w:rPr>
           <w:rFonts w:asciiTheme="majorBidi" w:hAnsiTheme="majorBidi" w:cstheme="majorBidi"/>
-          <w:b/>
-          <w:bCs/>
           <w:lang w:val="es-GT"/>
         </w:rPr>
         <w:t>Progreso general, con peso de 0.60:</w:t>
@@ -190,7 +204,14 @@
           <w:rFonts w:asciiTheme="majorBidi" w:hAnsiTheme="majorBidi" w:cstheme="majorBidi"/>
           <w:lang w:val="es-GT"/>
         </w:rPr>
-        <w:t xml:space="preserve"> Entonces si una pieza de P1 se encuentra en la fila 9, columna 9, su progreso será de 1.</w:t>
+        <w:t xml:space="preserve"> Entonces si una pieza de P1 se </w:t>
+      </w:r>
+      <w:r>
+        <w:rPr>
+          <w:rFonts w:asciiTheme="majorBidi" w:hAnsiTheme="majorBidi" w:cstheme="majorBidi"/>
+          <w:lang w:val="es-GT"/>
+        </w:rPr>
+        <w:t>encuentra en la fila 9, columna 9, su progreso será de 1.</w:t>
       </w:r>
     </w:p>
     <w:p>
@@ -208,217 +229,278 @@
       <w:r>
         <w:rPr>
           <w:rFonts w:asciiTheme="majorBidi" w:hAnsiTheme="majorBidi" w:cstheme="majorBidi"/>
+          <w:lang w:val="es-GT"/>
+        </w:rPr>
+        <w:t>Ocupación del campamento objetivo, con peso de 0.40:</w:t>
+      </w:r>
+      <w:r>
+        <w:rPr>
+          <w:rFonts w:asciiTheme="majorBidi" w:hAnsiTheme="majorBidi" w:cstheme="majorBidi"/>
+          <w:lang w:val="es-GT"/>
+        </w:rPr>
+        <w:t xml:space="preserve"> compara cuántas piezas propias tiene cada jugador dentro del campamento al que debe llegar.</w:t>
+      </w:r>
+      <w:r>
+        <w:rPr>
+          <w:rFonts w:asciiTheme="majorBidi" w:hAnsiTheme="majorBidi" w:cstheme="majorBidi"/>
+          <w:lang w:val="es-GT"/>
+        </w:rPr>
+        <w:t xml:space="preserve"> También lo normalizo sobre 15</w:t>
+      </w:r>
+      <w:r>
+        <w:rPr>
+          <w:rFonts w:asciiTheme="majorBidi" w:hAnsiTheme="majorBidi" w:cstheme="majorBidi"/>
+          <w:lang w:val="es-GT"/>
+        </w:rPr>
+        <w:t xml:space="preserve"> al restar piezas de P1 en el campamento contrario menos piezas de P2 en el campamento contrario.</w:t>
+      </w:r>
+    </w:p>
+    <w:p>
+      <w:pPr>
+        <w:jc w:val="both"/>
+        <w:rPr>
+          <w:rFonts w:asciiTheme="majorBidi" w:hAnsiTheme="majorBidi" w:cstheme="majorBidi"/>
+          <w:lang w:val="es-GT"/>
+        </w:rPr>
+      </w:pPr>
+      <w:r>
+        <w:rPr>
+          <w:rFonts w:asciiTheme="majorBidi" w:hAnsiTheme="majorBidi" w:cstheme="majorBidi"/>
+          <w:lang w:val="es-GT"/>
+        </w:rPr>
+        <w:t>La fórmula utilizada es:</w:t>
+      </w:r>
+    </w:p>
+    <w:p>
+      <w:pPr>
+        <w:jc w:val="both"/>
+        <w:rPr>
+          <w:rFonts w:asciiTheme="majorBidi" w:hAnsiTheme="majorBidi" w:cstheme="majorBidi"/>
+          <w:lang w:val="es-GT"/>
+        </w:rPr>
+      </w:pPr>
+      <w:proofErr w:type="spellStart"/>
+      <w:r>
+        <w:rPr>
+          <w:rFonts w:asciiTheme="majorBidi" w:hAnsiTheme="majorBidi" w:cstheme="majorBidi"/>
+          <w:lang w:val="es-GT"/>
+        </w:rPr>
+        <w:t>heuristic</w:t>
+      </w:r>
+      <w:proofErr w:type="spellEnd"/>
+      <w:r>
+        <w:rPr>
+          <w:rFonts w:asciiTheme="majorBidi" w:hAnsiTheme="majorBidi" w:cstheme="majorBidi"/>
+          <w:lang w:val="es-GT"/>
+        </w:rPr>
+        <w:t xml:space="preserve"> = (</w:t>
+      </w:r>
+    </w:p>
+    <w:p>
+      <w:pPr>
+        <w:jc w:val="both"/>
+        <w:rPr>
+          <w:rFonts w:asciiTheme="majorBidi" w:hAnsiTheme="majorBidi" w:cstheme="majorBidi"/>
+          <w:lang w:val="es-GT"/>
+        </w:rPr>
+      </w:pPr>
+      <w:r>
+        <w:rPr>
+          <w:rFonts w:asciiTheme="majorBidi" w:hAnsiTheme="majorBidi" w:cstheme="majorBidi"/>
+          <w:lang w:val="es-GT"/>
+        </w:rPr>
+        <w:t xml:space="preserve">    0.60 * </w:t>
+      </w:r>
+      <w:proofErr w:type="spellStart"/>
+      <w:r>
+        <w:rPr>
+          <w:rFonts w:asciiTheme="majorBidi" w:hAnsiTheme="majorBidi" w:cstheme="majorBidi"/>
+          <w:lang w:val="es-GT"/>
+        </w:rPr>
+        <w:t>progress_balance</w:t>
+      </w:r>
+      <w:proofErr w:type="spellEnd"/>
+    </w:p>
+    <w:p>
+      <w:pPr>
+        <w:jc w:val="both"/>
+        <w:rPr>
+          <w:rFonts w:asciiTheme="majorBidi" w:hAnsiTheme="majorBidi" w:cstheme="majorBidi"/>
+          <w:lang w:val="es-GT"/>
+        </w:rPr>
+      </w:pPr>
+      <w:r>
+        <w:rPr>
+          <w:rFonts w:asciiTheme="majorBidi" w:hAnsiTheme="majorBidi" w:cstheme="majorBidi"/>
+          <w:lang w:val="es-GT"/>
+        </w:rPr>
+        <w:t xml:space="preserve">    + 0.40 * </w:t>
+      </w:r>
+      <w:proofErr w:type="spellStart"/>
+      <w:r>
+        <w:rPr>
+          <w:rFonts w:asciiTheme="majorBidi" w:hAnsiTheme="majorBidi" w:cstheme="majorBidi"/>
+          <w:lang w:val="es-GT"/>
+        </w:rPr>
+        <w:t>camp_balance</w:t>
+      </w:r>
+      <w:proofErr w:type="spellEnd"/>
+    </w:p>
+    <w:p>
+      <w:pPr>
+        <w:jc w:val="both"/>
+        <w:rPr>
+          <w:rFonts w:asciiTheme="majorBidi" w:hAnsiTheme="majorBidi" w:cstheme="majorBidi"/>
+          <w:lang w:val="es-GT"/>
+        </w:rPr>
+      </w:pPr>
+      <w:r>
+        <w:rPr>
+          <w:rFonts w:asciiTheme="majorBidi" w:hAnsiTheme="majorBidi" w:cstheme="majorBidi"/>
+          <w:lang w:val="es-GT"/>
+        </w:rPr>
+        <w:t>)</w:t>
+      </w:r>
+    </w:p>
+    <w:p>
+      <w:pPr>
+        <w:jc w:val="both"/>
+        <w:rPr>
+          <w:rFonts w:asciiTheme="majorBidi" w:hAnsiTheme="majorBidi" w:cstheme="majorBidi"/>
+          <w:lang w:val="es-GT"/>
+        </w:rPr>
+      </w:pPr>
+      <w:r>
+        <w:rPr>
+          <w:rFonts w:asciiTheme="majorBidi" w:hAnsiTheme="majorBidi" w:cstheme="majorBidi"/>
+          <w:lang w:val="es-GT"/>
+        </w:rPr>
+        <w:t>El progreso tiene un peso mayor porque permite distinguir posiciones favorables desde las primeras etapas de la partida, cuando todavía no hay piezas dentro del campamento contrario. La ocupación del objetivo recibe una bonificación adicional porque acercarse a completar el campamento representa una ventaja más directa.</w:t>
+      </w:r>
+      <w:r>
+        <w:rPr>
+          <w:rFonts w:asciiTheme="majorBidi" w:hAnsiTheme="majorBidi" w:cstheme="majorBidi"/>
+          <w:lang w:val="es-GT"/>
+        </w:rPr>
+        <w:t xml:space="preserve"> </w:t>
+      </w:r>
+    </w:p>
+    <w:p>
+      <w:pPr>
+        <w:jc w:val="both"/>
+        <w:rPr>
+          <w:rFonts w:asciiTheme="majorBidi" w:hAnsiTheme="majorBidi" w:cstheme="majorBidi"/>
+          <w:lang w:val="es-GT"/>
+        </w:rPr>
+      </w:pPr>
+      <w:r>
+        <w:rPr>
+          <w:rFonts w:asciiTheme="majorBidi" w:hAnsiTheme="majorBidi" w:cstheme="majorBidi"/>
+          <w:lang w:val="es-GT"/>
+        </w:rPr>
+        <w:t>Si el estado ya es terminal,</w:t>
+      </w:r>
+      <w:r>
+        <w:rPr>
+          <w:rFonts w:asciiTheme="majorBidi" w:hAnsiTheme="majorBidi" w:cstheme="majorBidi"/>
+          <w:lang w:val="es-GT"/>
+        </w:rPr>
+        <w:t xml:space="preserve"> entonces</w:t>
+      </w:r>
+      <w:r>
+        <w:rPr>
+          <w:rFonts w:asciiTheme="majorBidi" w:hAnsiTheme="majorBidi" w:cstheme="majorBidi"/>
+          <w:lang w:val="es-GT"/>
+        </w:rPr>
+        <w:t xml:space="preserve"> la heurística no realiza una estimación.</w:t>
+      </w:r>
+      <w:r>
+        <w:rPr>
+          <w:rFonts w:asciiTheme="majorBidi" w:hAnsiTheme="majorBidi" w:cstheme="majorBidi"/>
+          <w:lang w:val="es-GT"/>
+        </w:rPr>
+        <w:t xml:space="preserve"> La función hace una validación antes de seguir y e</w:t>
+      </w:r>
+      <w:r>
+        <w:rPr>
+          <w:rFonts w:asciiTheme="majorBidi" w:hAnsiTheme="majorBidi" w:cstheme="majorBidi"/>
+          <w:lang w:val="es-GT"/>
+        </w:rPr>
+        <w:t xml:space="preserve">n ese caso se utiliza </w:t>
+      </w:r>
+      <w:proofErr w:type="spellStart"/>
+      <w:proofErr w:type="gramStart"/>
+      <w:r>
+        <w:rPr>
+          <w:rFonts w:asciiTheme="majorBidi" w:hAnsiTheme="majorBidi" w:cstheme="majorBidi"/>
+          <w:lang w:val="es-GT"/>
+        </w:rPr>
+        <w:t>utility</w:t>
+      </w:r>
+      <w:proofErr w:type="spellEnd"/>
+      <w:r>
+        <w:rPr>
+          <w:rFonts w:asciiTheme="majorBidi" w:hAnsiTheme="majorBidi" w:cstheme="majorBidi"/>
+          <w:lang w:val="es-GT"/>
+        </w:rPr>
+        <w:t>(</w:t>
+      </w:r>
+      <w:proofErr w:type="gramEnd"/>
+      <w:r>
+        <w:rPr>
+          <w:rFonts w:asciiTheme="majorBidi" w:hAnsiTheme="majorBidi" w:cstheme="majorBidi"/>
+          <w:lang w:val="es-GT"/>
+        </w:rPr>
+        <w:t>), que devuelve +1 si gana P1 y -1 si gana P</w:t>
+      </w:r>
+      <w:r>
+        <w:rPr>
+          <w:rFonts w:asciiTheme="majorBidi" w:hAnsiTheme="majorBidi" w:cstheme="majorBidi"/>
+          <w:lang w:val="es-GT"/>
+        </w:rPr>
+        <w:t>2. Mientras el juego sigue sin ganadores su valor es de 0.</w:t>
+      </w:r>
+    </w:p>
+    <w:p>
+      <w:pPr>
+        <w:jc w:val="both"/>
+        <w:rPr>
+          <w:rFonts w:asciiTheme="majorBidi" w:hAnsiTheme="majorBidi" w:cstheme="majorBidi"/>
+          <w:lang w:val="es-GT"/>
+        </w:rPr>
+      </w:pPr>
+      <w:r>
+        <w:rPr>
+          <w:rFonts w:asciiTheme="majorBidi" w:hAnsiTheme="majorBidi" w:cstheme="majorBidi"/>
+          <w:lang w:val="es-GT"/>
+        </w:rPr>
+        <w:t>Una limitación de esta heurística es que el progreso total puede considerar equivalentes dos situaciones distintas: avanzar mucho una sola pieza o avanzar poco varias piezas</w:t>
+      </w:r>
+      <w:r>
+        <w:rPr>
+          <w:rFonts w:asciiTheme="majorBidi" w:hAnsiTheme="majorBidi" w:cstheme="majorBidi"/>
+          <w:lang w:val="es-GT"/>
+        </w:rPr>
+        <w:t xml:space="preserve"> porque avanzar una sola pieza tendría más peso relativo que el avance que múltiples piezas tienen</w:t>
+      </w:r>
+      <w:r>
+        <w:rPr>
+          <w:rFonts w:asciiTheme="majorBidi" w:hAnsiTheme="majorBidi" w:cstheme="majorBidi"/>
+          <w:lang w:val="es-GT"/>
+        </w:rPr>
+        <w:t>. Si ambas opciones producen la misma suma de distancias, reciben el mismo valor.</w:t>
+      </w:r>
+    </w:p>
+    <w:p>
+      <w:pPr>
+        <w:jc w:val="both"/>
+        <w:rPr>
+          <w:rFonts w:asciiTheme="majorBidi" w:hAnsiTheme="majorBidi" w:cstheme="majorBidi"/>
           <w:b/>
           <w:bCs/>
           <w:lang w:val="es-GT"/>
         </w:rPr>
-        <w:t>Ocupación del campamento objetivo, con peso de 0.40:</w:t>
-      </w:r>
-      <w:r>
-        <w:rPr>
-          <w:rFonts w:asciiTheme="majorBidi" w:hAnsiTheme="majorBidi" w:cstheme="majorBidi"/>
-          <w:lang w:val="es-GT"/>
-        </w:rPr>
-        <w:t xml:space="preserve"> compara cuántas piezas propias tiene cada jugador dentro del campamento al que debe llegar.</w:t>
-      </w:r>
-      <w:r>
-        <w:rPr>
-          <w:rFonts w:asciiTheme="majorBidi" w:hAnsiTheme="majorBidi" w:cstheme="majorBidi"/>
-          <w:lang w:val="es-GT"/>
-        </w:rPr>
-        <w:t xml:space="preserve"> También lo normalizo sobre 15</w:t>
-      </w:r>
-      <w:r>
-        <w:rPr>
-          <w:rFonts w:asciiTheme="majorBidi" w:hAnsiTheme="majorBidi" w:cstheme="majorBidi"/>
-          <w:lang w:val="es-GT"/>
-        </w:rPr>
-        <w:t xml:space="preserve"> al restar piezas de P1 en el campamento contrario menos piezas de P2 en el campamento contrario.</w:t>
-      </w:r>
-    </w:p>
-    <w:p>
-      <w:pPr>
-        <w:jc w:val="both"/>
-        <w:rPr>
-          <w:rFonts w:asciiTheme="majorBidi" w:hAnsiTheme="majorBidi" w:cstheme="majorBidi"/>
-          <w:lang w:val="es-GT"/>
-        </w:rPr>
-      </w:pPr>
-      <w:r>
-        <w:rPr>
-          <w:rFonts w:asciiTheme="majorBidi" w:hAnsiTheme="majorBidi" w:cstheme="majorBidi"/>
-          <w:lang w:val="es-GT"/>
-        </w:rPr>
-        <w:t>La fórmula utilizada es:</w:t>
-      </w:r>
-    </w:p>
-    <w:p>
-      <w:pPr>
-        <w:jc w:val="both"/>
-        <w:rPr>
-          <w:rFonts w:asciiTheme="majorBidi" w:hAnsiTheme="majorBidi" w:cstheme="majorBidi"/>
-          <w:lang w:val="es-GT"/>
-        </w:rPr>
-      </w:pPr>
-      <w:r>
-        <w:rPr>
-          <w:rFonts w:asciiTheme="majorBidi" w:hAnsiTheme="majorBidi" w:cstheme="majorBidi"/>
-          <w:lang w:val="es-GT"/>
-        </w:rPr>
-        <w:t>heuristic = (</w:t>
-      </w:r>
-    </w:p>
-    <w:p>
-      <w:pPr>
-        <w:jc w:val="both"/>
-        <w:rPr>
-          <w:rFonts w:asciiTheme="majorBidi" w:hAnsiTheme="majorBidi" w:cstheme="majorBidi"/>
-          <w:lang w:val="es-GT"/>
-        </w:rPr>
-      </w:pPr>
-      <w:r>
-        <w:rPr>
-          <w:rFonts w:asciiTheme="majorBidi" w:hAnsiTheme="majorBidi" w:cstheme="majorBidi"/>
-          <w:lang w:val="es-GT"/>
-        </w:rPr>
-        <w:t xml:space="preserve">    0.60 * progress_balance</w:t>
-      </w:r>
-    </w:p>
-    <w:p>
-      <w:pPr>
-        <w:jc w:val="both"/>
-        <w:rPr>
-          <w:rFonts w:asciiTheme="majorBidi" w:hAnsiTheme="majorBidi" w:cstheme="majorBidi"/>
-          <w:lang w:val="es-GT"/>
-        </w:rPr>
-      </w:pPr>
-      <w:r>
-        <w:rPr>
-          <w:rFonts w:asciiTheme="majorBidi" w:hAnsiTheme="majorBidi" w:cstheme="majorBidi"/>
-          <w:lang w:val="es-GT"/>
-        </w:rPr>
-        <w:t xml:space="preserve">    + 0.40 * camp_balance</w:t>
-      </w:r>
-    </w:p>
-    <w:p>
-      <w:pPr>
-        <w:jc w:val="both"/>
-        <w:rPr>
-          <w:rFonts w:asciiTheme="majorBidi" w:hAnsiTheme="majorBidi" w:cstheme="majorBidi"/>
-          <w:lang w:val="es-GT"/>
-        </w:rPr>
-      </w:pPr>
-      <w:r>
-        <w:rPr>
-          <w:rFonts w:asciiTheme="majorBidi" w:hAnsiTheme="majorBidi" w:cstheme="majorBidi"/>
-          <w:lang w:val="es-GT"/>
-        </w:rPr>
-        <w:t>)</w:t>
-      </w:r>
-    </w:p>
-    <w:p>
-      <w:pPr>
-        <w:jc w:val="both"/>
-        <w:rPr>
-          <w:rFonts w:asciiTheme="majorBidi" w:hAnsiTheme="majorBidi" w:cstheme="majorBidi"/>
-          <w:lang w:val="es-GT"/>
-        </w:rPr>
-      </w:pPr>
-      <w:r>
-        <w:rPr>
-          <w:rFonts w:asciiTheme="majorBidi" w:hAnsiTheme="majorBidi" w:cstheme="majorBidi"/>
-          <w:lang w:val="es-GT"/>
-        </w:rPr>
-        <w:t>El progreso tiene un peso mayor porque permite distinguir posiciones favorables desde las primeras etapas de la partida, cuando todavía no hay piezas dentro del campamento contrario. La ocupación del objetivo recibe una bonificación adicional porque acercarse a completar el campamento representa una ventaja más directa.</w:t>
-      </w:r>
-      <w:r>
-        <w:rPr>
-          <w:rFonts w:asciiTheme="majorBidi" w:hAnsiTheme="majorBidi" w:cstheme="majorBidi"/>
-          <w:lang w:val="es-GT"/>
-        </w:rPr>
-        <w:t xml:space="preserve"> </w:t>
-      </w:r>
-    </w:p>
-    <w:p>
-      <w:pPr>
-        <w:jc w:val="both"/>
-        <w:rPr>
-          <w:rFonts w:asciiTheme="majorBidi" w:hAnsiTheme="majorBidi" w:cstheme="majorBidi"/>
-          <w:lang w:val="es-GT"/>
-        </w:rPr>
-      </w:pPr>
-      <w:r>
-        <w:rPr>
-          <w:rFonts w:asciiTheme="majorBidi" w:hAnsiTheme="majorBidi" w:cstheme="majorBidi"/>
-          <w:lang w:val="es-GT"/>
-        </w:rPr>
-        <w:t>Si el estado ya es terminal,</w:t>
-      </w:r>
-      <w:r>
-        <w:rPr>
-          <w:rFonts w:asciiTheme="majorBidi" w:hAnsiTheme="majorBidi" w:cstheme="majorBidi"/>
-          <w:lang w:val="es-GT"/>
-        </w:rPr>
-        <w:t xml:space="preserve"> entonces</w:t>
-      </w:r>
-      <w:r>
-        <w:rPr>
-          <w:rFonts w:asciiTheme="majorBidi" w:hAnsiTheme="majorBidi" w:cstheme="majorBidi"/>
-          <w:lang w:val="es-GT"/>
-        </w:rPr>
-        <w:t xml:space="preserve"> la heurística no realiza una estimación.</w:t>
-      </w:r>
-      <w:r>
-        <w:rPr>
-          <w:rFonts w:asciiTheme="majorBidi" w:hAnsiTheme="majorBidi" w:cstheme="majorBidi"/>
-          <w:lang w:val="es-GT"/>
-        </w:rPr>
-        <w:t xml:space="preserve"> La función hace una validación antes de seguir y e</w:t>
-      </w:r>
-      <w:r>
-        <w:rPr>
-          <w:rFonts w:asciiTheme="majorBidi" w:hAnsiTheme="majorBidi" w:cstheme="majorBidi"/>
-          <w:lang w:val="es-GT"/>
-        </w:rPr>
-        <w:t>n ese caso se utiliza utility(), que devuelve +1 si gana P1 y -1 si gana P</w:t>
-      </w:r>
-      <w:r>
-        <w:rPr>
-          <w:rFonts w:asciiTheme="majorBidi" w:hAnsiTheme="majorBidi" w:cstheme="majorBidi"/>
-          <w:lang w:val="es-GT"/>
-        </w:rPr>
-        <w:t>2. Mientras el juego sigue sin ganadores su valor es de 0.</w:t>
-      </w:r>
-    </w:p>
-    <w:p>
-      <w:pPr>
-        <w:jc w:val="both"/>
-        <w:rPr>
-          <w:rFonts w:asciiTheme="majorBidi" w:hAnsiTheme="majorBidi" w:cstheme="majorBidi"/>
-          <w:lang w:val="es-GT"/>
-        </w:rPr>
-      </w:pPr>
-      <w:r>
-        <w:rPr>
-          <w:rFonts w:asciiTheme="majorBidi" w:hAnsiTheme="majorBidi" w:cstheme="majorBidi"/>
-          <w:lang w:val="es-GT"/>
-        </w:rPr>
-        <w:t>Una limitación de esta heurística es que el progreso total puede considerar equivalentes dos situaciones distintas: avanzar mucho una sola pieza o avanzar poco varias piezas</w:t>
-      </w:r>
-      <w:r>
-        <w:rPr>
-          <w:rFonts w:asciiTheme="majorBidi" w:hAnsiTheme="majorBidi" w:cstheme="majorBidi"/>
-          <w:lang w:val="es-GT"/>
-        </w:rPr>
-        <w:t xml:space="preserve"> porque avanzar una sola pieza tendría más peso relativo que el avance que múltiples piezas tienen</w:t>
-      </w:r>
-      <w:r>
-        <w:rPr>
-          <w:rFonts w:asciiTheme="majorBidi" w:hAnsiTheme="majorBidi" w:cstheme="majorBidi"/>
-          <w:lang w:val="es-GT"/>
-        </w:rPr>
-        <w:t>. Si ambas opciones producen la misma suma de distancias, reciben el mismo valor.</w:t>
-      </w:r>
+      </w:pPr>
     </w:p>
     <w:p>
       <w:pPr>
@@ -441,24 +523,13 @@
           <w:lang w:val="es-GT"/>
         </w:rPr>
       </w:pPr>
-    </w:p>
-    <w:p>
-      <w:pPr>
-        <w:jc w:val="both"/>
+      <w:r>
         <w:rPr>
           <w:rFonts w:asciiTheme="majorBidi" w:hAnsiTheme="majorBidi" w:cstheme="majorBidi"/>
           <w:b/>
           <w:bCs/>
           <w:lang w:val="es-GT"/>
         </w:rPr>
-      </w:pPr>
-      <w:r>
-        <w:rPr>
-          <w:rFonts w:asciiTheme="majorBidi" w:hAnsiTheme="majorBidi" w:cstheme="majorBidi"/>
-          <w:b/>
-          <w:bCs/>
-          <w:lang w:val="es-GT"/>
-        </w:rPr>
         <w:lastRenderedPageBreak/>
         <w:t>Manejo de la profundidad</w:t>
       </w:r>
@@ -476,7 +547,39 @@
           <w:rFonts w:asciiTheme="majorBidi" w:hAnsiTheme="majorBidi" w:cstheme="majorBidi"/>
           <w:lang w:val="es-GT"/>
         </w:rPr>
-        <w:t>La búsqueda utiliza un parámetro configurable llamado depth, que indica cuántos turnos futuros puede explorar Minimax. Cada llamada recursiva reduce este valor en uno.</w:t>
+        <w:t xml:space="preserve">La búsqueda utiliza un parámetro configurable llamado </w:t>
+      </w:r>
+      <w:proofErr w:type="spellStart"/>
+      <w:r>
+        <w:rPr>
+          <w:rFonts w:asciiTheme="majorBidi" w:hAnsiTheme="majorBidi" w:cstheme="majorBidi"/>
+          <w:lang w:val="es-GT"/>
+        </w:rPr>
+        <w:t>depth</w:t>
+      </w:r>
+      <w:proofErr w:type="spellEnd"/>
+      <w:r>
+        <w:rPr>
+          <w:rFonts w:asciiTheme="majorBidi" w:hAnsiTheme="majorBidi" w:cstheme="majorBidi"/>
+          <w:lang w:val="es-GT"/>
+        </w:rPr>
+        <w:t xml:space="preserve">, que indica cuántos turnos futuros puede explorar </w:t>
+      </w:r>
+      <w:proofErr w:type="spellStart"/>
+      <w:r>
+        <w:rPr>
+          <w:rFonts w:asciiTheme="majorBidi" w:hAnsiTheme="majorBidi" w:cstheme="majorBidi"/>
+          <w:lang w:val="es-GT"/>
+        </w:rPr>
+        <w:t>Minimax</w:t>
+      </w:r>
+      <w:proofErr w:type="spellEnd"/>
+      <w:r>
+        <w:rPr>
+          <w:rFonts w:asciiTheme="majorBidi" w:hAnsiTheme="majorBidi" w:cstheme="majorBidi"/>
+          <w:lang w:val="es-GT"/>
+        </w:rPr>
+        <w:t>. Cada llamada recursiva reduce este valor en uno.</w:t>
       </w:r>
     </w:p>
     <w:p>
@@ -510,7 +613,21 @@
         <w:rPr>
           <w:rFonts w:asciiTheme="majorBidi" w:hAnsiTheme="majorBidi" w:cstheme="majorBidi"/>
         </w:rPr>
-        <w:t>Una jugada de P1.</w:t>
+        <w:t xml:space="preserve">Una </w:t>
+      </w:r>
+      <w:proofErr w:type="spellStart"/>
+      <w:r>
+        <w:rPr>
+          <w:rFonts w:asciiTheme="majorBidi" w:hAnsiTheme="majorBidi" w:cstheme="majorBidi"/>
+        </w:rPr>
+        <w:t>jugada</w:t>
+      </w:r>
+      <w:proofErr w:type="spellEnd"/>
+      <w:r>
+        <w:rPr>
+          <w:rFonts w:asciiTheme="majorBidi" w:hAnsiTheme="majorBidi" w:cstheme="majorBidi"/>
+        </w:rPr>
+        <w:t xml:space="preserve"> de P1.</w:t>
       </w:r>
     </w:p>
     <w:p>
@@ -573,7 +690,23 @@
           <w:rFonts w:asciiTheme="majorBidi" w:hAnsiTheme="majorBidi" w:cstheme="majorBidi"/>
           <w:lang w:val="es-GT"/>
         </w:rPr>
-        <w:t>Cuando depth llega a cero, la búsqueda se detiene y utiliza la función heurística para evaluar el estado alcanzado.</w:t>
+        <w:t xml:space="preserve">Cuando </w:t>
+      </w:r>
+      <w:proofErr w:type="spellStart"/>
+      <w:r>
+        <w:rPr>
+          <w:rFonts w:asciiTheme="majorBidi" w:hAnsiTheme="majorBidi" w:cstheme="majorBidi"/>
+          <w:lang w:val="es-GT"/>
+        </w:rPr>
+        <w:t>depth</w:t>
+      </w:r>
+      <w:proofErr w:type="spellEnd"/>
+      <w:r>
+        <w:rPr>
+          <w:rFonts w:asciiTheme="majorBidi" w:hAnsiTheme="majorBidi" w:cstheme="majorBidi"/>
+          <w:lang w:val="es-GT"/>
+        </w:rPr>
+        <w:t xml:space="preserve"> llega a cero, la búsqueda se detiene y utiliza la función heurística para evaluar el estado alcanzado.</w:t>
       </w:r>
     </w:p>
     <w:p>
@@ -636,12 +769,37 @@
           <w:lang w:val="es-GT"/>
         </w:rPr>
       </w:pPr>
-      <w:r>
-        <w:rPr>
-          <w:rFonts w:asciiTheme="majorBidi" w:hAnsiTheme="majorBidi" w:cstheme="majorBidi"/>
-          <w:lang w:val="es-GT"/>
-        </w:rPr>
-        <w:t>if depth == 0:</w:t>
+      <w:proofErr w:type="spellStart"/>
+      <w:r>
+        <w:rPr>
+          <w:rFonts w:asciiTheme="majorBidi" w:hAnsiTheme="majorBidi" w:cstheme="majorBidi"/>
+          <w:lang w:val="es-GT"/>
+        </w:rPr>
+        <w:t>if</w:t>
+      </w:r>
+      <w:proofErr w:type="spellEnd"/>
+      <w:r>
+        <w:rPr>
+          <w:rFonts w:asciiTheme="majorBidi" w:hAnsiTheme="majorBidi" w:cstheme="majorBidi"/>
+          <w:lang w:val="es-GT"/>
+        </w:rPr>
+        <w:t xml:space="preserve"> </w:t>
+      </w:r>
+      <w:proofErr w:type="spellStart"/>
+      <w:r>
+        <w:rPr>
+          <w:rFonts w:asciiTheme="majorBidi" w:hAnsiTheme="majorBidi" w:cstheme="majorBidi"/>
+          <w:lang w:val="es-GT"/>
+        </w:rPr>
+        <w:t>depth</w:t>
+      </w:r>
+      <w:proofErr w:type="spellEnd"/>
+      <w:r>
+        <w:rPr>
+          <w:rFonts w:asciiTheme="majorBidi" w:hAnsiTheme="majorBidi" w:cstheme="majorBidi"/>
+          <w:lang w:val="es-GT"/>
+        </w:rPr>
+        <w:t xml:space="preserve"> == 0:</w:t>
       </w:r>
     </w:p>
     <w:p>
@@ -808,23 +966,96 @@
           <w:rFonts w:asciiTheme="majorBidi" w:hAnsiTheme="majorBidi" w:cstheme="majorBidi"/>
           <w:lang w:val="es-GT"/>
         </w:rPr>
-        <w:t>Antes de comenzar se calcula un instante límite o deadline mediante time.perf_counter(). Todas las llamadas recursivas reciben el mismo límite y comprueban periódicamente si todavía queda tiempo.</w:t>
-      </w:r>
-    </w:p>
-    <w:p>
-      <w:pPr>
-        <w:jc w:val="both"/>
-        <w:rPr>
-          <w:rFonts w:asciiTheme="majorBidi" w:hAnsiTheme="majorBidi" w:cstheme="majorBidi"/>
-          <w:lang w:val="es-GT"/>
-        </w:rPr>
-      </w:pPr>
-      <w:r>
-        <w:rPr>
-          <w:rFonts w:asciiTheme="majorBidi" w:hAnsiTheme="majorBidi" w:cstheme="majorBidi"/>
-          <w:lang w:val="es-GT"/>
-        </w:rPr>
-        <w:t>Cuando se alcanza el límite, se lanza una excepción SearchTimeout. Esta excepción interrumpe inmediatamente la profundidad que se estaba explorando y permite devolver la acción encontrada en la última profundidad completada.</w:t>
+        <w:t xml:space="preserve">Antes de comenzar se calcula un instante límite o </w:t>
+      </w:r>
+      <w:proofErr w:type="spellStart"/>
+      <w:r>
+        <w:rPr>
+          <w:rFonts w:asciiTheme="majorBidi" w:hAnsiTheme="majorBidi" w:cstheme="majorBidi"/>
+          <w:lang w:val="es-GT"/>
+        </w:rPr>
+        <w:t>deadline</w:t>
+      </w:r>
+      <w:proofErr w:type="spellEnd"/>
+      <w:r>
+        <w:rPr>
+          <w:rFonts w:asciiTheme="majorBidi" w:hAnsiTheme="majorBidi" w:cstheme="majorBidi"/>
+          <w:lang w:val="es-GT"/>
+        </w:rPr>
+        <w:t xml:space="preserve"> mediante </w:t>
+      </w:r>
+      <w:proofErr w:type="spellStart"/>
+      <w:proofErr w:type="gramStart"/>
+      <w:r>
+        <w:rPr>
+          <w:rFonts w:asciiTheme="majorBidi" w:hAnsiTheme="majorBidi" w:cstheme="majorBidi"/>
+          <w:lang w:val="es-GT"/>
+        </w:rPr>
+        <w:t>time.perf</w:t>
+      </w:r>
+      <w:proofErr w:type="gramEnd"/>
+      <w:r>
+        <w:rPr>
+          <w:rFonts w:asciiTheme="majorBidi" w:hAnsiTheme="majorBidi" w:cstheme="majorBidi"/>
+          <w:lang w:val="es-GT"/>
+        </w:rPr>
+        <w:t>_</w:t>
+      </w:r>
+      <w:proofErr w:type="gramStart"/>
+      <w:r>
+        <w:rPr>
+          <w:rFonts w:asciiTheme="majorBidi" w:hAnsiTheme="majorBidi" w:cstheme="majorBidi"/>
+          <w:lang w:val="es-GT"/>
+        </w:rPr>
+        <w:t>counter</w:t>
+      </w:r>
+      <w:proofErr w:type="spellEnd"/>
+      <w:r>
+        <w:rPr>
+          <w:rFonts w:asciiTheme="majorBidi" w:hAnsiTheme="majorBidi" w:cstheme="majorBidi"/>
+          <w:lang w:val="es-GT"/>
+        </w:rPr>
+        <w:t>(</w:t>
+      </w:r>
+      <w:proofErr w:type="gramEnd"/>
+      <w:r>
+        <w:rPr>
+          <w:rFonts w:asciiTheme="majorBidi" w:hAnsiTheme="majorBidi" w:cstheme="majorBidi"/>
+          <w:lang w:val="es-GT"/>
+        </w:rPr>
+        <w:t>). Todas las llamadas recursivas reciben el mismo límite y comprueban periódicamente si todavía queda tiempo.</w:t>
+      </w:r>
+    </w:p>
+    <w:p>
+      <w:pPr>
+        <w:jc w:val="both"/>
+        <w:rPr>
+          <w:rFonts w:asciiTheme="majorBidi" w:hAnsiTheme="majorBidi" w:cstheme="majorBidi"/>
+          <w:lang w:val="es-GT"/>
+        </w:rPr>
+      </w:pPr>
+      <w:r>
+        <w:rPr>
+          <w:rFonts w:asciiTheme="majorBidi" w:hAnsiTheme="majorBidi" w:cstheme="majorBidi"/>
+          <w:lang w:val="es-GT"/>
+        </w:rPr>
+        <w:t xml:space="preserve">Cuando se alcanza el límite, se lanza una excepción </w:t>
+      </w:r>
+      <w:proofErr w:type="spellStart"/>
+      <w:r>
+        <w:rPr>
+          <w:rFonts w:asciiTheme="majorBidi" w:hAnsiTheme="majorBidi" w:cstheme="majorBidi"/>
+          <w:lang w:val="es-GT"/>
+        </w:rPr>
+        <w:t>SearchTimeout</w:t>
+      </w:r>
+      <w:proofErr w:type="spellEnd"/>
+      <w:r>
+        <w:rPr>
+          <w:rFonts w:asciiTheme="majorBidi" w:hAnsiTheme="majorBidi" w:cstheme="majorBidi"/>
+          <w:lang w:val="es-GT"/>
+        </w:rPr>
+        <w:t>. Esta excepción interrumpe inmediatamente la profundidad que se estaba explorando y permite devolver la acción encontrada en la última profundidad completada.</w:t>
       </w:r>
     </w:p>
     <w:p>
@@ -974,7 +1205,60 @@
           <w:rFonts w:asciiTheme="majorBidi" w:hAnsiTheme="majorBidi" w:cstheme="majorBidi"/>
           <w:lang w:val="es-GT"/>
         </w:rPr>
-        <w:t>Las pruebas verificaron movimientos simples, saltos sobre piezas propias y rivales, cadenas de saltos, inmutabilidad de los estados, cambio de turno, acciones ilegales, victorias y la regla anti-bloqueo. También se comprobó que Minimax devuelve acciones legales y que el controlador termina inmediatamente cuando detecta un ganador.</w:t>
+        <w:t xml:space="preserve">Las pruebas verificaron movimientos simples, saltos sobre piezas propias y rivales, cadenas de saltos, inmutabilidad de los estados, cambio de turno, acciones ilegales, victorias y la regla </w:t>
+      </w:r>
+      <w:proofErr w:type="spellStart"/>
+      <w:r>
+        <w:rPr>
+          <w:rFonts w:asciiTheme="majorBidi" w:hAnsiTheme="majorBidi" w:cstheme="majorBidi"/>
+          <w:lang w:val="es-GT"/>
+        </w:rPr>
+        <w:t>anti-bloqueo</w:t>
+      </w:r>
+      <w:proofErr w:type="spellEnd"/>
+      <w:r>
+        <w:rPr>
+          <w:rFonts w:asciiTheme="majorBidi" w:hAnsiTheme="majorBidi" w:cstheme="majorBidi"/>
+          <w:lang w:val="es-GT"/>
+        </w:rPr>
+        <w:t>, que según recuerdo quedaba a criterio de cada quién</w:t>
+      </w:r>
+      <w:r>
+        <w:rPr>
+          <w:rFonts w:asciiTheme="majorBidi" w:hAnsiTheme="majorBidi" w:cstheme="majorBidi"/>
+          <w:lang w:val="es-GT"/>
+        </w:rPr>
+        <w:t xml:space="preserve">. También se comprobó que </w:t>
+      </w:r>
+      <w:proofErr w:type="spellStart"/>
+      <w:r>
+        <w:rPr>
+          <w:rFonts w:asciiTheme="majorBidi" w:hAnsiTheme="majorBidi" w:cstheme="majorBidi"/>
+          <w:lang w:val="es-GT"/>
+        </w:rPr>
+        <w:t>Minimax</w:t>
+      </w:r>
+      <w:proofErr w:type="spellEnd"/>
+      <w:r>
+        <w:rPr>
+          <w:rFonts w:asciiTheme="majorBidi" w:hAnsiTheme="majorBidi" w:cstheme="majorBidi"/>
+          <w:lang w:val="es-GT"/>
+        </w:rPr>
+        <w:t xml:space="preserve"> </w:t>
+      </w:r>
+      <w:r>
+        <w:rPr>
+          <w:rFonts w:asciiTheme="majorBidi" w:hAnsiTheme="majorBidi" w:cstheme="majorBidi"/>
+          <w:lang w:val="es-GT"/>
+        </w:rPr>
+        <w:t>devolviese</w:t>
+      </w:r>
+      <w:r>
+        <w:rPr>
+          <w:rFonts w:asciiTheme="majorBidi" w:hAnsiTheme="majorBidi" w:cstheme="majorBidi"/>
+          <w:lang w:val="es-GT"/>
+        </w:rPr>
+        <w:t xml:space="preserve"> acciones legales y que el controlador termina inmediatamente cuando detecta un ganador.</w:t>
       </w:r>
     </w:p>
     <w:p>
@@ -1022,7 +1306,23 @@
           <w:rFonts w:asciiTheme="majorBidi" w:hAnsiTheme="majorBidi" w:cstheme="majorBidi"/>
           <w:lang w:val="es-GT"/>
         </w:rPr>
-        <w:t>Finalmente, se agregó una interfaz con Pygame que permite jugar humano contra agente y observar agente contra agente. La lógica del juego se mantiene separada de la interfaz, por lo que las mismas funciones pueden utilizarse desde la consola, las pruebas o la ventana gráfica.</w:t>
+        <w:t xml:space="preserve">Finalmente, se agregó una interfaz con </w:t>
+      </w:r>
+      <w:proofErr w:type="spellStart"/>
+      <w:r>
+        <w:rPr>
+          <w:rFonts w:asciiTheme="majorBidi" w:hAnsiTheme="majorBidi" w:cstheme="majorBidi"/>
+          <w:lang w:val="es-GT"/>
+        </w:rPr>
+        <w:t>Pygame</w:t>
+      </w:r>
+      <w:proofErr w:type="spellEnd"/>
+      <w:r>
+        <w:rPr>
+          <w:rFonts w:asciiTheme="majorBidi" w:hAnsiTheme="majorBidi" w:cstheme="majorBidi"/>
+          <w:lang w:val="es-GT"/>
+        </w:rPr>
+        <w:t xml:space="preserve"> que permite jugar humano contra agente y observar agente contra agente. La lógica del juego se mantiene separada de la interfaz, por lo que las mismas funciones pueden utilizarse desde la consola, las pruebas o la ventana gráfica.</w:t>
       </w:r>
     </w:p>
     <w:p>

</xml_diff>